<commit_message>
Add IRB review documents
</commit_message>
<xml_diff>
--- a/Pre-IRB Review.docx
+++ b/Pre-IRB Review.docx
@@ -4,6 +4,375 @@
   <w:body>
     <w:p>
       <w:pPr>
+        <w:ind w:left="360"/>
+      </w:pPr>
+      <w:r>
+        <w:rPr>
+          <w:b/>
+        </w:rPr>
+        <w:t>Interventions get only one rating round.</w:t>
+      </w:r>
+      <w:r>
+        <w:t xml:space="preserve"> They are rated only in Round 2, with no feedback or re-rating, so "consensus" on interventions is really a single survey. Either add interventions to Round </w:t>
+      </w:r>
+      <w:proofErr w:type="gramStart"/>
+      <w:r>
+        <w:t>1, or</w:t>
+      </w:r>
+      <w:proofErr w:type="gramEnd"/>
+      <w:r>
+        <w:t xml:space="preserve"> state this limitation and avoid calling it a Delphi consensus. The same applies to new items suggested in Round 1 comments: say how they enter Round 2.</w:t>
+      </w:r>
+    </w:p>
+    <w:p>
+      <w:pPr>
+        <w:tabs>
+          <w:tab w:val="num" w:pos="720"/>
+        </w:tabs>
+        <w:spacing w:before="100" w:beforeAutospacing="1" w:after="100" w:afterAutospacing="1" w:line="240" w:lineRule="auto"/>
+        <w:ind w:left="720" w:hanging="360"/>
+      </w:pPr>
+    </w:p>
+    <w:p>
+      <w:pPr>
+        <w:numPr>
+          <w:ilvl w:val="0"/>
+          <w:numId w:val="11"/>
+        </w:numPr>
+        <w:spacing w:before="100" w:beforeAutospacing="1" w:after="100" w:afterAutospacing="1" w:line="240" w:lineRule="auto"/>
+        <w:rPr>
+          <w:color w:val="000000"/>
+          <w:sz w:val="27"/>
+          <w:szCs w:val="27"/>
+        </w:rPr>
+      </w:pPr>
+      <w:r>
+        <w:rPr>
+          <w:rStyle w:val="Strong"/>
+          <w:color w:val="000000"/>
+          <w:sz w:val="27"/>
+          <w:szCs w:val="27"/>
+        </w:rPr>
+        <w:t>Retention:</w:t>
+      </w:r>
+      <w:r>
+        <w:rPr>
+          <w:rStyle w:val="apple-converted-space"/>
+          <w:color w:val="000000"/>
+          <w:sz w:val="27"/>
+          <w:szCs w:val="27"/>
+        </w:rPr>
+        <w:t> </w:t>
+      </w:r>
+      <w:r>
+        <w:rPr>
+          <w:color w:val="000000"/>
+          <w:sz w:val="27"/>
+          <w:szCs w:val="27"/>
+        </w:rPr>
+        <w:t xml:space="preserve">Section 9 now says </w:t>
+      </w:r>
+      <w:proofErr w:type="gramStart"/>
+      <w:r>
+        <w:rPr>
+          <w:color w:val="000000"/>
+          <w:sz w:val="27"/>
+          <w:szCs w:val="27"/>
+        </w:rPr>
+        <w:t>only</w:t>
+      </w:r>
+      <w:proofErr w:type="gramEnd"/>
+      <w:r>
+        <w:rPr>
+          <w:color w:val="000000"/>
+          <w:sz w:val="27"/>
+          <w:szCs w:val="27"/>
+        </w:rPr>
+        <w:t xml:space="preserve"> “seven years” and doesn’t say what happens to the linkage file, while the information sheet says it is destroyed after Round 2 and withdrawals. Add one sentence to Section 9.</w:t>
+      </w:r>
+    </w:p>
+    <w:p>
+      <w:pPr>
+        <w:numPr>
+          <w:ilvl w:val="0"/>
+          <w:numId w:val="11"/>
+        </w:numPr>
+        <w:spacing w:before="100" w:beforeAutospacing="1" w:after="100" w:afterAutospacing="1" w:line="240" w:lineRule="auto"/>
+        <w:rPr>
+          <w:color w:val="000000"/>
+          <w:sz w:val="27"/>
+          <w:szCs w:val="27"/>
+        </w:rPr>
+      </w:pPr>
+      <w:r>
+        <w:rPr>
+          <w:rStyle w:val="Strong"/>
+          <w:color w:val="000000"/>
+          <w:sz w:val="27"/>
+          <w:szCs w:val="27"/>
+        </w:rPr>
+        <w:t>Withdrawal:</w:t>
+      </w:r>
+      <w:r>
+        <w:rPr>
+          <w:rStyle w:val="apple-converted-space"/>
+          <w:color w:val="000000"/>
+          <w:sz w:val="27"/>
+          <w:szCs w:val="27"/>
+        </w:rPr>
+        <w:t> </w:t>
+      </w:r>
+      <w:r>
+        <w:rPr>
+          <w:color w:val="000000"/>
+          <w:sz w:val="27"/>
+          <w:szCs w:val="27"/>
+        </w:rPr>
+        <w:t>There is still no date for when removal is possible.</w:t>
+      </w:r>
+    </w:p>
+    <w:p>
+      <w:pPr>
+        <w:numPr>
+          <w:ilvl w:val="0"/>
+          <w:numId w:val="11"/>
+        </w:numPr>
+        <w:spacing w:before="100" w:beforeAutospacing="1" w:after="100" w:afterAutospacing="1" w:line="240" w:lineRule="auto"/>
+        <w:rPr>
+          <w:color w:val="000000"/>
+          <w:sz w:val="27"/>
+          <w:szCs w:val="27"/>
+        </w:rPr>
+      </w:pPr>
+      <w:r>
+        <w:rPr>
+          <w:rStyle w:val="Strong"/>
+          <w:color w:val="000000"/>
+          <w:sz w:val="27"/>
+          <w:szCs w:val="27"/>
+        </w:rPr>
+        <w:t>Consent form:</w:t>
+      </w:r>
+      <w:r>
+        <w:rPr>
+          <w:rStyle w:val="apple-converted-space"/>
+          <w:color w:val="000000"/>
+          <w:sz w:val="27"/>
+          <w:szCs w:val="27"/>
+        </w:rPr>
+        <w:t> </w:t>
+      </w:r>
+      <w:r>
+        <w:rPr>
+          <w:color w:val="000000"/>
+          <w:sz w:val="27"/>
+          <w:szCs w:val="27"/>
+        </w:rPr>
+        <w:t>Items 11 and 12 (contact retention and linkage) should be mandatory. Mark which items are required.</w:t>
+      </w:r>
+    </w:p>
+    <w:p>
+      <w:pPr>
+        <w:numPr>
+          <w:ilvl w:val="0"/>
+          <w:numId w:val="11"/>
+        </w:numPr>
+        <w:spacing w:before="100" w:beforeAutospacing="1" w:after="100" w:afterAutospacing="1" w:line="240" w:lineRule="auto"/>
+        <w:rPr>
+          <w:color w:val="000000"/>
+          <w:sz w:val="27"/>
+          <w:szCs w:val="27"/>
+        </w:rPr>
+      </w:pPr>
+      <w:r>
+        <w:rPr>
+          <w:rStyle w:val="Strong"/>
+          <w:color w:val="000000"/>
+          <w:sz w:val="27"/>
+          <w:szCs w:val="27"/>
+        </w:rPr>
+        <w:t>Dean as chair:</w:t>
+      </w:r>
+      <w:r>
+        <w:rPr>
+          <w:rStyle w:val="apple-converted-space"/>
+          <w:color w:val="000000"/>
+          <w:sz w:val="27"/>
+          <w:szCs w:val="27"/>
+        </w:rPr>
+        <w:t> </w:t>
+      </w:r>
+      <w:r>
+        <w:rPr>
+          <w:color w:val="000000"/>
+          <w:sz w:val="27"/>
+          <w:szCs w:val="27"/>
+        </w:rPr>
+        <w:t>The advisory board is still led by the Dean. Section 12 does not yet include the governance paragraph I drafted.</w:t>
+      </w:r>
+    </w:p>
+    <w:p>
+      <w:pPr>
+        <w:numPr>
+          <w:ilvl w:val="0"/>
+          <w:numId w:val="11"/>
+        </w:numPr>
+        <w:spacing w:before="100" w:beforeAutospacing="1" w:after="100" w:afterAutospacing="1" w:line="240" w:lineRule="auto"/>
+        <w:rPr>
+          <w:color w:val="000000"/>
+          <w:sz w:val="27"/>
+          <w:szCs w:val="27"/>
+        </w:rPr>
+      </w:pPr>
+      <w:r>
+        <w:rPr>
+          <w:rStyle w:val="Strong"/>
+          <w:color w:val="000000"/>
+          <w:sz w:val="27"/>
+          <w:szCs w:val="27"/>
+        </w:rPr>
+        <w:t>Affiliation:</w:t>
+      </w:r>
+      <w:r>
+        <w:rPr>
+          <w:rStyle w:val="apple-converted-space"/>
+          <w:color w:val="000000"/>
+          <w:sz w:val="27"/>
+          <w:szCs w:val="27"/>
+        </w:rPr>
+        <w:t> </w:t>
+      </w:r>
+      <w:r>
+        <w:rPr>
+          <w:color w:val="000000"/>
+          <w:sz w:val="27"/>
+          <w:szCs w:val="27"/>
+        </w:rPr>
+        <w:t>The study email is still an Ain Shams address while the lead institution is MTI. I haven’t seen an answer to the comment on this in the doc.</w:t>
+      </w:r>
+    </w:p>
+    <w:p>
+      <w:pPr>
+        <w:numPr>
+          <w:ilvl w:val="0"/>
+          <w:numId w:val="11"/>
+        </w:numPr>
+        <w:spacing w:before="100" w:beforeAutospacing="1" w:after="100" w:afterAutospacing="1" w:line="240" w:lineRule="auto"/>
+        <w:rPr>
+          <w:color w:val="000000"/>
+          <w:sz w:val="27"/>
+          <w:szCs w:val="27"/>
+        </w:rPr>
+      </w:pPr>
+      <w:r>
+        <w:rPr>
+          <w:rStyle w:val="Strong"/>
+          <w:color w:val="000000"/>
+          <w:sz w:val="27"/>
+          <w:szCs w:val="27"/>
+        </w:rPr>
+        <w:t>Interventions:</w:t>
+      </w:r>
+      <w:r>
+        <w:rPr>
+          <w:rStyle w:val="apple-converted-space"/>
+          <w:color w:val="000000"/>
+          <w:sz w:val="27"/>
+          <w:szCs w:val="27"/>
+        </w:rPr>
+        <w:t> </w:t>
+      </w:r>
+      <w:r>
+        <w:rPr>
+          <w:color w:val="000000"/>
+          <w:sz w:val="27"/>
+          <w:szCs w:val="27"/>
+        </w:rPr>
+        <w:t>They are still rated only once, in Round 2.</w:t>
+      </w:r>
+    </w:p>
+    <w:p>
+      <w:pPr>
+        <w:numPr>
+          <w:ilvl w:val="0"/>
+          <w:numId w:val="11"/>
+        </w:numPr>
+        <w:spacing w:before="100" w:beforeAutospacing="1" w:after="100" w:afterAutospacing="1" w:line="240" w:lineRule="auto"/>
+        <w:rPr>
+          <w:color w:val="000000"/>
+          <w:sz w:val="27"/>
+          <w:szCs w:val="27"/>
+        </w:rPr>
+      </w:pPr>
+      <w:r>
+        <w:rPr>
+          <w:rStyle w:val="Strong"/>
+          <w:color w:val="000000"/>
+          <w:sz w:val="27"/>
+          <w:szCs w:val="27"/>
+        </w:rPr>
+        <w:t>Polarization rule:</w:t>
+      </w:r>
+      <w:r>
+        <w:rPr>
+          <w:rStyle w:val="apple-converted-space"/>
+          <w:color w:val="000000"/>
+          <w:sz w:val="27"/>
+          <w:szCs w:val="27"/>
+        </w:rPr>
+        <w:t> </w:t>
+      </w:r>
+      <w:r>
+        <w:rPr>
+          <w:color w:val="000000"/>
+          <w:sz w:val="27"/>
+          <w:szCs w:val="27"/>
+        </w:rPr>
+        <w:t>“Meaningful polarization” is still undefined, and there is still no ranking or cut-off for “principal” barriers.</w:t>
+      </w:r>
+    </w:p>
+    <w:p>
+      <w:pPr>
+        <w:numPr>
+          <w:ilvl w:val="0"/>
+          <w:numId w:val="11"/>
+        </w:numPr>
+        <w:spacing w:before="100" w:beforeAutospacing="1" w:after="100" w:afterAutospacing="1" w:line="240" w:lineRule="auto"/>
+        <w:rPr>
+          <w:color w:val="000000"/>
+          <w:sz w:val="27"/>
+          <w:szCs w:val="27"/>
+        </w:rPr>
+      </w:pPr>
+      <w:r>
+        <w:rPr>
+          <w:rStyle w:val="Strong"/>
+          <w:color w:val="000000"/>
+          <w:sz w:val="27"/>
+          <w:szCs w:val="27"/>
+        </w:rPr>
+        <w:t>Panel:</w:t>
+      </w:r>
+      <w:r>
+        <w:rPr>
+          <w:rStyle w:val="apple-converted-space"/>
+          <w:color w:val="000000"/>
+          <w:sz w:val="27"/>
+          <w:szCs w:val="27"/>
+        </w:rPr>
+        <w:t> </w:t>
+      </w:r>
+      <w:r>
+        <w:rPr>
+          <w:color w:val="000000"/>
+          <w:sz w:val="27"/>
+          <w:szCs w:val="27"/>
+        </w:rPr>
+        <w:t>The sampling frame, variation dimensions and oversampling plan are not stated. Early-career researchers choosing their own group is a reasonable alternative to my precedence rule, but it may leave the 10-person groups short.</w:t>
+      </w:r>
+    </w:p>
+    <w:p>
+      <w:pPr>
         <w:pStyle w:val="ListParagraph"/>
         <w:numPr>
           <w:ilvl w:val="0"/>
@@ -27,32 +396,6 @@
       </w:pPr>
       <w:r>
         <w:t>Items 11 and 12 (retaining contact details, linking rounds) are required for a two-round design. Make them conditions of participation, and mark which items are mandatory and which optional (15–17).</w:t>
-      </w:r>
-    </w:p>
-    <w:p>
-      <w:pPr>
-        <w:pStyle w:val="ListParagraph"/>
-        <w:numPr>
-          <w:ilvl w:val="0"/>
-          <w:numId w:val="2"/>
-        </w:numPr>
-      </w:pPr>
-      <w:r>
-        <w:rPr>
-          <w:b/>
-        </w:rPr>
-        <w:t>Interventions get only one rating round.</w:t>
-      </w:r>
-      <w:r>
-        <w:t xml:space="preserve"> They are rated only in Round 2, with no feedback or re-rating, so "consensus" on interventions is really a single survey. Either add interventions to Round </w:t>
-      </w:r>
-      <w:proofErr w:type="gramStart"/>
-      <w:r>
-        <w:t>1, or</w:t>
-      </w:r>
-      <w:proofErr w:type="gramEnd"/>
-      <w:r>
-        <w:t xml:space="preserve"> state this limitation and avoid calling it a Delphi consensus. The same applies to new items suggested in Round 1 comments: say how they enter Round 2.</w:t>
       </w:r>
     </w:p>
     <w:p>
@@ -332,6 +675,272 @@
       <w:lvlText w:val="▪"/>
       <w:lvlJc w:val="left"/>
       <w:pPr>
+        <w:ind w:left="6480" w:hanging="360"/>
+      </w:pPr>
+    </w:lvl>
+  </w:abstractNum>
+  <w:abstractNum w:abstractNumId="2" w15:restartNumberingAfterBreak="0">
+    <w:nsid w:val="0A395DCE"/>
+    <w:multiLevelType w:val="multilevel"/>
+    <w:tmpl w:val="CE2C016C"/>
+    <w:lvl w:ilvl="0">
+      <w:start w:val="1"/>
+      <w:numFmt w:val="bullet"/>
+      <w:lvlText w:val=""/>
+      <w:lvlJc w:val="left"/>
+      <w:pPr>
+        <w:tabs>
+          <w:tab w:val="num" w:pos="720"/>
+        </w:tabs>
+        <w:ind w:left="720" w:hanging="360"/>
+      </w:pPr>
+      <w:rPr>
+        <w:rFonts w:ascii="Symbol" w:hAnsi="Symbol" w:hint="default"/>
+        <w:sz w:val="20"/>
+      </w:rPr>
+    </w:lvl>
+    <w:lvl w:ilvl="1" w:tentative="1">
+      <w:start w:val="1"/>
+      <w:numFmt w:val="bullet"/>
+      <w:lvlText w:val="o"/>
+      <w:lvlJc w:val="left"/>
+      <w:pPr>
+        <w:tabs>
+          <w:tab w:val="num" w:pos="1440"/>
+        </w:tabs>
+        <w:ind w:left="1440" w:hanging="360"/>
+      </w:pPr>
+      <w:rPr>
+        <w:rFonts w:ascii="Courier New" w:hAnsi="Courier New" w:hint="default"/>
+        <w:sz w:val="20"/>
+      </w:rPr>
+    </w:lvl>
+    <w:lvl w:ilvl="2" w:tentative="1">
+      <w:start w:val="1"/>
+      <w:numFmt w:val="bullet"/>
+      <w:lvlText w:val=""/>
+      <w:lvlJc w:val="left"/>
+      <w:pPr>
+        <w:tabs>
+          <w:tab w:val="num" w:pos="2160"/>
+        </w:tabs>
+        <w:ind w:left="2160" w:hanging="360"/>
+      </w:pPr>
+      <w:rPr>
+        <w:rFonts w:ascii="Wingdings" w:hAnsi="Wingdings" w:hint="default"/>
+        <w:sz w:val="20"/>
+      </w:rPr>
+    </w:lvl>
+    <w:lvl w:ilvl="3" w:tentative="1">
+      <w:start w:val="1"/>
+      <w:numFmt w:val="bullet"/>
+      <w:lvlText w:val=""/>
+      <w:lvlJc w:val="left"/>
+      <w:pPr>
+        <w:tabs>
+          <w:tab w:val="num" w:pos="2880"/>
+        </w:tabs>
+        <w:ind w:left="2880" w:hanging="360"/>
+      </w:pPr>
+      <w:rPr>
+        <w:rFonts w:ascii="Wingdings" w:hAnsi="Wingdings" w:hint="default"/>
+        <w:sz w:val="20"/>
+      </w:rPr>
+    </w:lvl>
+    <w:lvl w:ilvl="4" w:tentative="1">
+      <w:start w:val="1"/>
+      <w:numFmt w:val="bullet"/>
+      <w:lvlText w:val=""/>
+      <w:lvlJc w:val="left"/>
+      <w:pPr>
+        <w:tabs>
+          <w:tab w:val="num" w:pos="3600"/>
+        </w:tabs>
+        <w:ind w:left="3600" w:hanging="360"/>
+      </w:pPr>
+      <w:rPr>
+        <w:rFonts w:ascii="Wingdings" w:hAnsi="Wingdings" w:hint="default"/>
+        <w:sz w:val="20"/>
+      </w:rPr>
+    </w:lvl>
+    <w:lvl w:ilvl="5" w:tentative="1">
+      <w:start w:val="1"/>
+      <w:numFmt w:val="bullet"/>
+      <w:lvlText w:val=""/>
+      <w:lvlJc w:val="left"/>
+      <w:pPr>
+        <w:tabs>
+          <w:tab w:val="num" w:pos="4320"/>
+        </w:tabs>
+        <w:ind w:left="4320" w:hanging="360"/>
+      </w:pPr>
+      <w:rPr>
+        <w:rFonts w:ascii="Wingdings" w:hAnsi="Wingdings" w:hint="default"/>
+        <w:sz w:val="20"/>
+      </w:rPr>
+    </w:lvl>
+    <w:lvl w:ilvl="6" w:tentative="1">
+      <w:start w:val="1"/>
+      <w:numFmt w:val="bullet"/>
+      <w:lvlText w:val=""/>
+      <w:lvlJc w:val="left"/>
+      <w:pPr>
+        <w:tabs>
+          <w:tab w:val="num" w:pos="5040"/>
+        </w:tabs>
+        <w:ind w:left="5040" w:hanging="360"/>
+      </w:pPr>
+      <w:rPr>
+        <w:rFonts w:ascii="Wingdings" w:hAnsi="Wingdings" w:hint="default"/>
+        <w:sz w:val="20"/>
+      </w:rPr>
+    </w:lvl>
+    <w:lvl w:ilvl="7" w:tentative="1">
+      <w:start w:val="1"/>
+      <w:numFmt w:val="bullet"/>
+      <w:lvlText w:val=""/>
+      <w:lvlJc w:val="left"/>
+      <w:pPr>
+        <w:tabs>
+          <w:tab w:val="num" w:pos="5760"/>
+        </w:tabs>
+        <w:ind w:left="5760" w:hanging="360"/>
+      </w:pPr>
+      <w:rPr>
+        <w:rFonts w:ascii="Wingdings" w:hAnsi="Wingdings" w:hint="default"/>
+        <w:sz w:val="20"/>
+      </w:rPr>
+    </w:lvl>
+    <w:lvl w:ilvl="8" w:tentative="1">
+      <w:start w:val="1"/>
+      <w:numFmt w:val="bullet"/>
+      <w:lvlText w:val=""/>
+      <w:lvlJc w:val="left"/>
+      <w:pPr>
+        <w:tabs>
+          <w:tab w:val="num" w:pos="6480"/>
+        </w:tabs>
+        <w:ind w:left="6480" w:hanging="360"/>
+      </w:pPr>
+      <w:rPr>
+        <w:rFonts w:ascii="Wingdings" w:hAnsi="Wingdings" w:hint="default"/>
+        <w:sz w:val="20"/>
+      </w:rPr>
+    </w:lvl>
+  </w:abstractNum>
+  <w:abstractNum w:abstractNumId="3" w15:restartNumberingAfterBreak="0">
+    <w:nsid w:val="2BFC2E3D"/>
+    <w:multiLevelType w:val="multilevel"/>
+    <w:tmpl w:val="1374869E"/>
+    <w:lvl w:ilvl="0">
+      <w:start w:val="1"/>
+      <w:numFmt w:val="decimal"/>
+      <w:lvlText w:val="%1."/>
+      <w:lvlJc w:val="left"/>
+      <w:pPr>
+        <w:tabs>
+          <w:tab w:val="num" w:pos="720"/>
+        </w:tabs>
+        <w:ind w:left="720" w:hanging="360"/>
+      </w:pPr>
+    </w:lvl>
+    <w:lvl w:ilvl="1">
+      <w:start w:val="1"/>
+      <w:numFmt w:val="bullet"/>
+      <w:lvlText w:val="o"/>
+      <w:lvlJc w:val="left"/>
+      <w:pPr>
+        <w:tabs>
+          <w:tab w:val="num" w:pos="1440"/>
+        </w:tabs>
+        <w:ind w:left="1440" w:hanging="360"/>
+      </w:pPr>
+      <w:rPr>
+        <w:rFonts w:ascii="Courier New" w:hAnsi="Courier New" w:hint="default"/>
+        <w:sz w:val="20"/>
+      </w:rPr>
+    </w:lvl>
+    <w:lvl w:ilvl="2" w:tentative="1">
+      <w:start w:val="1"/>
+      <w:numFmt w:val="decimal"/>
+      <w:lvlText w:val="%3."/>
+      <w:lvlJc w:val="left"/>
+      <w:pPr>
+        <w:tabs>
+          <w:tab w:val="num" w:pos="2160"/>
+        </w:tabs>
+        <w:ind w:left="2160" w:hanging="360"/>
+      </w:pPr>
+    </w:lvl>
+    <w:lvl w:ilvl="3" w:tentative="1">
+      <w:start w:val="1"/>
+      <w:numFmt w:val="decimal"/>
+      <w:lvlText w:val="%4."/>
+      <w:lvlJc w:val="left"/>
+      <w:pPr>
+        <w:tabs>
+          <w:tab w:val="num" w:pos="2880"/>
+        </w:tabs>
+        <w:ind w:left="2880" w:hanging="360"/>
+      </w:pPr>
+    </w:lvl>
+    <w:lvl w:ilvl="4" w:tentative="1">
+      <w:start w:val="1"/>
+      <w:numFmt w:val="decimal"/>
+      <w:lvlText w:val="%5."/>
+      <w:lvlJc w:val="left"/>
+      <w:pPr>
+        <w:tabs>
+          <w:tab w:val="num" w:pos="3600"/>
+        </w:tabs>
+        <w:ind w:left="3600" w:hanging="360"/>
+      </w:pPr>
+    </w:lvl>
+    <w:lvl w:ilvl="5" w:tentative="1">
+      <w:start w:val="1"/>
+      <w:numFmt w:val="decimal"/>
+      <w:lvlText w:val="%6."/>
+      <w:lvlJc w:val="left"/>
+      <w:pPr>
+        <w:tabs>
+          <w:tab w:val="num" w:pos="4320"/>
+        </w:tabs>
+        <w:ind w:left="4320" w:hanging="360"/>
+      </w:pPr>
+    </w:lvl>
+    <w:lvl w:ilvl="6" w:tentative="1">
+      <w:start w:val="1"/>
+      <w:numFmt w:val="decimal"/>
+      <w:lvlText w:val="%7."/>
+      <w:lvlJc w:val="left"/>
+      <w:pPr>
+        <w:tabs>
+          <w:tab w:val="num" w:pos="5040"/>
+        </w:tabs>
+        <w:ind w:left="5040" w:hanging="360"/>
+      </w:pPr>
+    </w:lvl>
+    <w:lvl w:ilvl="7" w:tentative="1">
+      <w:start w:val="1"/>
+      <w:numFmt w:val="decimal"/>
+      <w:lvlText w:val="%8."/>
+      <w:lvlJc w:val="left"/>
+      <w:pPr>
+        <w:tabs>
+          <w:tab w:val="num" w:pos="5760"/>
+        </w:tabs>
+        <w:ind w:left="5760" w:hanging="360"/>
+      </w:pPr>
+    </w:lvl>
+    <w:lvl w:ilvl="8" w:tentative="1">
+      <w:start w:val="1"/>
+      <w:numFmt w:val="decimal"/>
+      <w:lvlText w:val="%9."/>
+      <w:lvlJc w:val="left"/>
+      <w:pPr>
+        <w:tabs>
+          <w:tab w:val="num" w:pos="6480"/>
+        </w:tabs>
         <w:ind w:left="6480" w:hanging="360"/>
       </w:pPr>
     </w:lvl>
@@ -365,6 +974,12 @@
   </w:num>
   <w:num w:numId="9" w16cid:durableId="1272783951">
     <w:abstractNumId w:val="1"/>
+  </w:num>
+  <w:num w:numId="10" w16cid:durableId="1635256773">
+    <w:abstractNumId w:val="3"/>
+  </w:num>
+  <w:num w:numId="11" w16cid:durableId="1687829564">
+    <w:abstractNumId w:val="2"/>
   </w:num>
 </w:numbering>
 </file>
@@ -994,6 +1609,22 @@
       </w:tblBorders>
     </w:tblPr>
   </w:style>
+  <w:style w:type="character" w:styleId="Strong">
+    <w:name w:val="Strong"/>
+    <w:basedOn w:val="DefaultParagraphFont"/>
+    <w:uiPriority w:val="22"/>
+    <w:qFormat/>
+    <w:rsid w:val="0034642D"/>
+    <w:rPr>
+      <w:b/>
+      <w:bCs/>
+    </w:rPr>
+  </w:style>
+  <w:style w:type="character" w:customStyle="1" w:styleId="apple-converted-space">
+    <w:name w:val="apple-converted-space"/>
+    <w:basedOn w:val="DefaultParagraphFont"/>
+    <w:rsid w:val="0034642D"/>
+  </w:style>
 </w:styles>
 </file>
 

</xml_diff>